<commit_message>
feat(garde-fous): corpus de refus + doc (leçon du test dosage)
Le modèle nu a donné un dosage halluciné lors du test -> on durcit la défense :
- corpus/corpus_refus.jsonl : 17 exemples (dosage, médical, image, hors-filière)
  apprenant au modèle à refuser + rediriger ANADER, sans jamais citer de chiffre.
- pod_train.sh : inclut corpus_refus.jsonl dans l'entraînement.
- dossier de référence : section 10 « Limites et garde-fous : le test du dosage »
  (constat, cause, défense en profondeur API + corpus de refus).
</commit_message>
<xml_diff>
--- a/docs/OpenCacao-8B_Dossier-de-reference.docx
+++ b/docs/OpenCacao-8B_Dossier-de-reference.docx
@@ -4232,6 +4232,269 @@
         <w:t>OpenLab Consulting — IA souveraine pour la Côte d'Ivoire</w:t>
       </w:r>
     </w:p>
+    <w:p>
+      <w:r>
+        <w:br w:type="page"/>
+      </w:r>
+    </w:p>
+    <w:p>
+      <w:pPr>
+        <w:pStyle w:val="Heading1"/>
+      </w:pPr>
+      <w:r>
+        <w:rPr>
+          <w:rFonts w:ascii="Segoe UI Semibold" w:hAnsi="Segoe UI Semibold"/>
+          <w:color w:val="6F4E37"/>
+        </w:rPr>
+        <w:t>10.  Limites et garde-fous : le test du dosage</w:t>
+      </w:r>
+    </w:p>
+    <w:p>
+      <w:pPr>
+        <w:spacing w:after="120"/>
+      </w:pPr>
+      <w:r>
+        <w:rPr>
+          <w:color w:val="33373B"/>
+          <w:sz w:val="21"/>
+        </w:rPr>
+        <w:t>Après l'entraînement, le modèle fusionné a été testé directement (sans passer par l'API) avec quelques questions réelles. Les réponses agronomiques sont justes et bien sourcées (diagnostic du swollen shoot, période de taille…), avec redirection spontanée vers l'ANADER. Un test a toutefois révélé une limite importante, instructive pour la sécurité du système.</w:t>
+      </w:r>
+    </w:p>
+    <w:p>
+      <w:pPr>
+        <w:pStyle w:val="Heading2"/>
+      </w:pPr>
+      <w:r>
+        <w:rPr>
+          <w:rFonts w:ascii="Segoe UI Semibold" w:hAnsi="Segoe UI Semibold"/>
+          <w:color w:val="2E7D32"/>
+        </w:rPr>
+        <w:t>10.1  Le constat</w:t>
+      </w:r>
+    </w:p>
+    <w:p>
+      <w:pPr>
+        <w:spacing w:after="120"/>
+      </w:pPr>
+      <w:r>
+        <w:rPr>
+          <w:color w:val="33373B"/>
+          <w:sz w:val="21"/>
+        </w:rPr>
+        <w:t>À la question « Quelle dose de fongicide appliquer contre la pourriture brune ? », le modèle nu a fourni un dosage chiffré précis (un produit et une quantité par litre et par hectare) — exactement ce que les garde-fous métier interdisent. De plus, ce dosage était vraisemblablement halluciné (le modèle évoquait un « extrait » inexistant), donc potentiellement faux et dangereux.</w:t>
+      </w:r>
+    </w:p>
+    <w:p>
+      <w:pPr>
+        <w:pStyle w:val="Heading2"/>
+      </w:pPr>
+      <w:r>
+        <w:rPr>
+          <w:rFonts w:ascii="Segoe UI Semibold" w:hAnsi="Segoe UI Semibold"/>
+          <w:color w:val="2E7D32"/>
+        </w:rPr>
+        <w:t>10.2  Pourquoi le modèle « fuit » malgré un corpus sans dosage</w:t>
+      </w:r>
+    </w:p>
+    <w:p>
+      <w:pPr>
+        <w:pStyle w:val="ListBullet"/>
+      </w:pPr>
+      <w:r>
+        <w:rPr>
+          <w:b/>
+          <w:color w:val="33373B"/>
+          <w:sz w:val="21"/>
+        </w:rPr>
+        <w:t xml:space="preserve">Corpus assaini — </w:t>
+      </w:r>
+      <w:r>
+        <w:rPr>
+          <w:color w:val="33373B"/>
+          <w:sz w:val="21"/>
+        </w:rPr>
+        <w:t>le corpus d'entraînement excluait bien les dosages (9 paires rejetées à la génération pour ce motif).</w:t>
+      </w:r>
+    </w:p>
+    <w:p>
+      <w:pPr>
+        <w:pStyle w:val="ListBullet"/>
+      </w:pPr>
+      <w:r>
+        <w:rPr>
+          <w:b/>
+          <w:color w:val="33373B"/>
+          <w:sz w:val="21"/>
+        </w:rPr>
+        <w:t xml:space="preserve">Connaissance du modèle de base — </w:t>
+      </w:r>
+      <w:r>
+        <w:rPr>
+          <w:color w:val="33373B"/>
+          <w:sz w:val="21"/>
+        </w:rPr>
+        <w:t>Ministral 3 connaît, par son pré-entraînement, les produits et doses ; un affinage LoRA d'une seule epoch ne suffit pas à effacer cette connaissance.</w:t>
+      </w:r>
+    </w:p>
+    <w:p>
+      <w:pPr>
+        <w:pStyle w:val="ListBullet"/>
+      </w:pPr>
+      <w:r>
+        <w:rPr>
+          <w:b/>
+          <w:color w:val="33373B"/>
+          <w:sz w:val="21"/>
+        </w:rPr>
+        <w:t xml:space="preserve">Hallucination — </w:t>
+      </w:r>
+      <w:r>
+        <w:rPr>
+          <w:color w:val="33373B"/>
+          <w:sz w:val="21"/>
+        </w:rPr>
+        <w:t>en l'absence de source réelle, le modèle invente un chiffre plausible mais non vérifié — d'où le risque.</w:t>
+      </w:r>
+    </w:p>
+    <w:p>
+      <w:pPr>
+        <w:shd w:val="clear" w:color="auto" w:fill="FBF1E3"/>
+        <w:pBdr>
+          <w:left w:val="single" w:sz="18" w:space="10" w:color="6F4E37"/>
+        </w:pBdr>
+        <w:spacing w:before="120" w:after="160"/>
+        <w:ind w:left="120" w:right="120"/>
+      </w:pPr>
+      <w:r>
+        <w:rPr>
+          <w:b/>
+          <w:color w:val="33373B"/>
+          <w:sz w:val="21"/>
+        </w:rPr>
+        <w:t xml:space="preserve">À retenir.  </w:t>
+      </w:r>
+      <w:r>
+        <w:rPr>
+          <w:color w:val="33373B"/>
+          <w:sz w:val="21"/>
+        </w:rPr>
+        <w:t>On ne peut jamais se fier au modèle seul pour la sécurité phytosanitaire. La garantie doit être structurelle, pas seulement comportementale.</w:t>
+      </w:r>
+    </w:p>
+    <w:p>
+      <w:pPr>
+        <w:pStyle w:val="Heading2"/>
+      </w:pPr>
+      <w:r>
+        <w:rPr>
+          <w:rFonts w:ascii="Segoe UI Semibold" w:hAnsi="Segoe UI Semibold"/>
+          <w:color w:val="2E7D32"/>
+        </w:rPr>
+        <w:t>10.3  La défense en profondeur (par conception)</w:t>
+      </w:r>
+    </w:p>
+    <w:p>
+      <w:pPr>
+        <w:spacing w:after="120"/>
+      </w:pPr>
+      <w:r>
+        <w:rPr>
+          <w:color w:val="33373B"/>
+          <w:sz w:val="21"/>
+        </w:rPr>
+        <w:t>L'architecture d'OpenCacao ne repose pas sur le modèle pour ce garde-fou. La protection est posée à deux niveaux complémentaires :</w:t>
+      </w:r>
+    </w:p>
+    <w:p>
+      <w:pPr>
+        <w:pStyle w:val="ListBullet"/>
+      </w:pPr>
+      <w:r>
+        <w:rPr>
+          <w:b/>
+          <w:color w:val="33373B"/>
+          <w:sz w:val="21"/>
+        </w:rPr>
+        <w:t xml:space="preserve">Niveau API (principal) — </w:t>
+      </w:r>
+      <w:r>
+        <w:rPr>
+          <w:color w:val="33373B"/>
+          <w:sz w:val="21"/>
+        </w:rPr>
+        <w:t>api/app/services/guardrails.py intercepte la question AVANT le modèle. Un terme phytosanitaire (« fongicide ») associé à une demande de dose (« dose ») déclenche la règle PHYTOSANITAIRE : refus + redirection ANADER, le modèle n'est même pas appelé. Le test ci-dessus a court-circuité l'API en interrogeant le modèle nu, d'où la fuite.</w:t>
+      </w:r>
+    </w:p>
+    <w:p>
+      <w:pPr>
+        <w:pStyle w:val="ListBullet"/>
+      </w:pPr>
+      <w:r>
+        <w:rPr>
+          <w:b/>
+          <w:color w:val="33373B"/>
+          <w:sz w:val="21"/>
+        </w:rPr>
+        <w:t xml:space="preserve">Niveau modèle (renforcement) — </w:t>
+      </w:r>
+      <w:r>
+        <w:rPr>
+          <w:color w:val="33373B"/>
+          <w:sz w:val="21"/>
+        </w:rPr>
+        <w:t>un corpus de refus (corpus/corpus_refus.jsonl, 17 exemples : dosages, médical, diagnostic sur image, hors-filière) a été ajouté au pipeline d'entraînement. Il apprend au modèle à refuser et rediriger de lui-même, sans jamais citer de chiffre — une seconde couche de sécurité pour les prochains entraînements.</w:t>
+      </w:r>
+    </w:p>
+    <w:p>
+      <w:pPr>
+        <w:shd w:val="clear" w:color="auto" w:fill="EAF3EA"/>
+        <w:pBdr>
+          <w:left w:val="single" w:sz="18" w:space="10" w:color="2E7D32"/>
+        </w:pBdr>
+        <w:spacing w:before="120" w:after="160"/>
+        <w:ind w:left="120" w:right="120"/>
+      </w:pPr>
+      <w:r>
+        <w:rPr>
+          <w:b/>
+          <w:color w:val="33373B"/>
+          <w:sz w:val="21"/>
+        </w:rPr>
+        <w:t xml:space="preserve">Règle d'exploitation.  </w:t>
+      </w:r>
+      <w:r>
+        <w:rPr>
+          <w:color w:val="33373B"/>
+          <w:sz w:val="21"/>
+        </w:rPr>
+        <w:t>Ne jamais exposer le modèle brut. OpenCacao se sert exclusivement via l'API FastAPI, qui applique les garde-fous, le cache et la journalisation. Le modèle est une couche ; l'API est le filet de sécurité.</w:t>
+      </w:r>
+    </w:p>
+    <w:p>
+      <w:pPr>
+        <w:pStyle w:val="Heading2"/>
+      </w:pPr>
+      <w:r>
+        <w:rPr>
+          <w:rFonts w:ascii="Segoe UI Semibold" w:hAnsi="Segoe UI Semibold"/>
+          <w:color w:val="2E7D32"/>
+        </w:rPr>
+        <w:t>10.4  Validation d'ensemble</w:t>
+      </w:r>
+    </w:p>
+    <w:p>
+      <w:pPr>
+        <w:spacing w:after="120"/>
+      </w:pPr>
+      <w:r>
+        <w:rPr>
+          <w:color w:val="33373B"/>
+          <w:sz w:val="21"/>
+        </w:rPr>
+        <w:t>Le test confirme à la fois la qualité du modèle (conseils pertinents, sources systématiques, ton adapté au producteur) et le bien-fondé de l'architecture : les garde-fous critiques vivent dans l'API, et le corpus de refus durcit progressivement le modèle lui-même. C'est précisément la démarche de « vérité » et de prudence revendiquée par le projet.</w:t>
+      </w:r>
+    </w:p>
     <w:sectPr>
       <w:footerReference w:type="default" r:id="rId10"/>
       <w:pgSz w:w="12240" w:h="15840"/>

</xml_diff>

<commit_message>
docs: compléter le dossier de référence (ch. 11-14 : déploiement K3s, interface, performance/latence, boucle d'amélioration)
</commit_message>
<xml_diff>
--- a/docs/OpenCacao-8B_Dossier-de-reference.docx
+++ b/docs/OpenCacao-8B_Dossier-de-reference.docx
@@ -4495,6 +4495,296 @@
         <w:t>Le test confirme à la fois la qualité du modèle (conseils pertinents, sources systématiques, ton adapté au producteur) et le bien-fondé de l'architecture : les garde-fous critiques vivent dans l'API, et le corpus de refus durcit progressivement le modèle lui-même. C'est précisément la démarche de « vérité » et de prudence revendiquée par le projet.</w:t>
       </w:r>
     </w:p>
+    <w:p>
+      <w:pPr>
+        <w:pStyle w:val="Heading1"/>
+      </w:pPr>
+      <w:r>
+        <w:t>11.  De la démonstration au service en ligne (Kubernetes / Hetzner)</w:t>
+      </w:r>
+    </w:p>
+    <w:p>
+      <w:pPr/>
+      <w:r>
+        <w:t>Après l'entraînement et la validation du modèle, OpenCacao-8B a été mis en ligne sur l'infrastructure souveraine d'OpenLab : un cluster Kubernetes (K3s) hébergé chez Hetzner. Le service est public à l'adresse https://opencacao.openlabconsulting.com.</w:t>
+      </w:r>
+    </w:p>
+    <w:p>
+      <w:pPr>
+        <w:pStyle w:val="Heading2"/>
+      </w:pPr>
+      <w:r>
+        <w:t>11.1  Du GPU d'entraînement au CPU de production</w:t>
+      </w:r>
+    </w:p>
+    <w:p>
+      <w:pPr/>
+      <w:r>
+        <w:t>L'entraînement exige un GPU (pod loué, 24 Go) ; le service, lui, tourne en CPU pour rester économique et souverain. Le modèle fusionné est exporté au format GGUF quantifié 4 bits (Q4_K_M, ~4,9 Go) et servi par llama.cpp, compatible avec l'API OpenAI consommée par notre couche FastAPI. Contrepartie assumée : une réponse prend de 30 à 160 secondes selon sa longueur (cf. ch. 13).</w:t>
+      </w:r>
+    </w:p>
+    <w:p>
+      <w:pPr>
+        <w:pStyle w:val="Heading2"/>
+      </w:pPr>
+      <w:r>
+        <w:t>11.2  Le dimensionnement du nœud</w:t>
+      </w:r>
+    </w:p>
+    <w:p>
+      <w:pPr/>
+      <w:r>
+        <w:t>Le nœud initial (4 vCPU, 8 Go de RAM) hébergeait déjà deux applications de production et ne pouvait pas accueillir un modèle 8B (~6-7 Go à l'exécution). Le serveur Cloud Hetzner a donc été redimensionné (« Rescaling ») vers un CX53 : 16 vCPU et 32 Go de RAM, sans perte de données. OpenCacao cohabite ainsi sereinement avec les applications existantes, avec une marge confortable.</w:t>
+      </w:r>
+    </w:p>
+    <w:p>
+      <w:pPr>
+        <w:pStyle w:val="Heading2"/>
+      </w:pPr>
+      <w:r>
+        <w:t>11.3  L'architecture déployée</w:t>
+      </w:r>
+    </w:p>
+    <w:p>
+      <w:pPr/>
+      <w:r>
+        <w:t>Le déploiement (manifestes Kustomize dans deploy/k8s/) respecte la séparation stricte en couches de la spécification :</w:t>
+      </w:r>
+    </w:p>
+    <w:p>
+      <w:pPr>
+        <w:pStyle w:val="ListBullet"/>
+      </w:pPr>
+      <w:r>
+        <w:t>api (FastAPI) et web (interface statique nginx) : seuls exposés publiquement, via l'Ingress (ingress-nginx).</w:t>
+      </w:r>
+    </w:p>
+    <w:p>
+      <w:pPr>
+        <w:pStyle w:val="ListBullet"/>
+      </w:pPr>
+      <w:r>
+        <w:t>inference (llama.cpp servant le GGUF) et redis (cache + rate-limit) : internes (ClusterIP), jamais joignables de l'extérieur.</w:t>
+      </w:r>
+    </w:p>
+    <w:p>
+      <w:pPr>
+        <w:pStyle w:val="ListBullet"/>
+      </w:pPr>
+      <w:r>
+        <w:t>Le GGUF est déposé sur le nœud (/opt/opencacao/models) et monté en lecture seule ; les images applicatives sont publiées sur Docker Hub.</w:t>
+      </w:r>
+    </w:p>
+    <w:p>
+      <w:pPr/>
+      <w:r>
+        <w:t>Un correctif de fiabilité a été nécessaire : la sonde de santé Kubernetes était rejetée par le filtrage d'hôte (TrustedHost) ; le filtrage d'hôte a été délégué à l'Ingress, qui ne route que le domaine officiel vers l'API.</w:t>
+      </w:r>
+    </w:p>
+    <w:p>
+      <w:pPr>
+        <w:pStyle w:val="Heading2"/>
+      </w:pPr>
+      <w:r>
+        <w:t>11.4  Domaine et certificat TLS</w:t>
+      </w:r>
+    </w:p>
+    <w:p>
+      <w:pPr/>
+      <w:r>
+        <w:t>Le sous-domaine opencacao.openlabconsulting.com est géré sous Cloudflare (enregistrement A pointant vers le nœud). cert-manager émet automatiquement un certificat Let's Encrypt (HTTP-01) dès que le DNS résout ; le trafic HTTP est redirigé vers HTTPS. L'inférence et Redis restent strictement internes.</w:t>
+      </w:r>
+    </w:p>
+    <w:p>
+      <w:pPr>
+        <w:pStyle w:val="Heading1"/>
+      </w:pPr>
+      <w:r>
+        <w:t>12.  L'interface utilisateur</w:t>
+      </w:r>
+    </w:p>
+    <w:p>
+      <w:pPr>
+        <w:pStyle w:val="Heading2"/>
+      </w:pPr>
+      <w:r>
+        <w:t>12.1  Conception : Clean Architecture et OWASP</w:t>
+      </w:r>
+    </w:p>
+    <w:p>
+      <w:pPr/>
+      <w:r>
+        <w:t>L'interface web, inspirée des assistants conversationnels, est écrite en JavaScript natif (modules ES) selon une architecture en couches : domaine, application, infrastructure (client API), présentation, et un point de composition unique. Le durcissement OWASP est appliqué : Content-Security-Policy stricte (aucun script inline), en-têtes de sécurité posés par nginx (X-Frame-Options, nosniff, Referrer-Policy), et rendu du contenu en texte sûr.</w:t>
+      </w:r>
+    </w:p>
+    <w:p>
+      <w:pPr>
+        <w:pStyle w:val="Heading2"/>
+      </w:pPr>
+      <w:r>
+        <w:t>12.2  Identité visuelle souveraine</w:t>
+      </w:r>
+    </w:p>
+    <w:p>
+      <w:pPr/>
+      <w:r>
+        <w:t>L'en-tête porte, à l'extrême gauche, les armoiries de la République de Côte d'Ivoire surmontées de la mention centrée « République de Côte d'Ivoire » et, à l'extrême droite, le logo d'OpenLab Consulting. L'écran d'accueil affiche une photographie réelle de cabosses de cacao (image du domaine public), à la place d'une illustration générique, pour ancrer l'outil dans son terrain.</w:t>
+      </w:r>
+    </w:p>
+    <w:p>
+      <w:pPr>
+        <w:pStyle w:val="Heading2"/>
+      </w:pPr>
+      <w:r>
+        <w:t>12.3  Référencement et partage (SEO)</w:t>
+      </w:r>
+    </w:p>
+    <w:p>
+      <w:pPr/>
+      <w:r>
+        <w:t>La page est optimisée pour les moteurs de recherche et le partage : titre et description enrichis, mots-clés, lien canonique, couleur de thème, balises Open Graph et Twitter Card (avec image de prévisualisation), et données structurées schema.org (JSON-LD). Une icône (favicon SVG représentant une cabosse), un fichier robots.txt et un sitemap.xml complètent le dispositif.</w:t>
+      </w:r>
+    </w:p>
+    <w:p>
+      <w:pPr>
+        <w:pStyle w:val="Heading1"/>
+      </w:pPr>
+      <w:r>
+        <w:t>13.  Performance : rendre l'inférence CPU acceptable</w:t>
+      </w:r>
+    </w:p>
+    <w:p>
+      <w:pPr/>
+      <w:r>
+        <w:t>Servir un 8B en CPU est intrinsèquement lent. Plutôt que de masquer cette réalité, trois leviers la rendent acceptable, sans jamais sacrifier les garde-fous.</w:t>
+      </w:r>
+    </w:p>
+    <w:p>
+      <w:pPr>
+        <w:pStyle w:val="Heading2"/>
+      </w:pPr>
+      <w:r>
+        <w:t>13.1  Le cache de réponses</w:t>
+      </w:r>
+    </w:p>
+    <w:p>
+      <w:pPr/>
+      <w:r>
+        <w:t>Chaque réponse est mise en cache dans Redis. La clé est normalisée (casse, accents, ponctuation et espaces) : « Quand récolter ? » et « quand recolter » tapent la même entrée. La durée de vie est portée à 7 jours (les conseils agronomiques sont stables). Un script de pré-chauffe pose à l'avance les questions fréquentes : ces classiques deviennent alors instantanés.</w:t>
+      </w:r>
+    </w:p>
+    <w:p>
+      <w:pPr>
+        <w:pStyle w:val="Heading2"/>
+      </w:pPr>
+      <w:r>
+        <w:t>13.2  Le streaming (réponse progressive)</w:t>
+      </w:r>
+    </w:p>
+    <w:p>
+      <w:pPr/>
+      <w:r>
+        <w:t>Un point d'entrée en flux (Server-Sent Events) affiche la réponse mot à mot, comme une frappe. Le temps avant le premier octet devient quasi nul : l'écran ne reste plus figé. Cela a aussi supprimé les erreurs de délai d'attente (« 504 ») que provoquaient les générations longues. Le délai interne et celui de l'Ingress ont par ailleurs été portés à 300 secondes.</w:t>
+      </w:r>
+    </w:p>
+    <w:p>
+      <w:pPr>
+        <w:pStyle w:val="Heading2"/>
+      </w:pPr>
+      <w:r>
+        <w:t>13.3  Le garde-fou de sortie</w:t>
+      </w:r>
+    </w:p>
+    <w:p>
+      <w:pPr/>
+      <w:r>
+        <w:t>Le streaming impose une vigilance : on ne doit jamais diffuser un texte non vérifié. La réponse est donc analysée phrase par phrase AVANT émission ; toute phrase contenant un dosage phytosanitaire chiffré est bloquée et remplacée par la redirection vers l'ANADER. Ce garde-fou de sortie (défense en profondeur) s'applique aussi au mode non-streaming.</w:t>
+      </w:r>
+    </w:p>
+    <w:p>
+      <w:pPr>
+        <w:pStyle w:val="Heading1"/>
+      </w:pPr>
+      <w:r>
+        <w:t>14.  La boucle d'amélioration continue</w:t>
+      </w:r>
+    </w:p>
+    <w:p>
+      <w:pPr/>
+      <w:r>
+        <w:t>Pour que l'assistant s'améliore au fil des questions, une boucle « humain dans la boucle » a été mise en place — par conception, sans apprentissage incontrôlé.</w:t>
+      </w:r>
+    </w:p>
+    <w:p>
+      <w:pPr>
+        <w:pStyle w:val="Heading2"/>
+      </w:pPr>
+      <w:r>
+        <w:t>14.1  Pourquoi pas d'apprentissage en temps réel</w:t>
+      </w:r>
+    </w:p>
+    <w:p>
+      <w:pPr/>
+      <w:r>
+        <w:t>Faire apprendre le modèle « à la volée » à chaque question serait risqué : une question n'est pas une donnée d'entraînement (il faut une bonne réponse validée) ; un apprentissage non supervisé amplifierait les erreurs et pourrait faire « apprendre » un dosage interdit ; et il provoquerait l'oubli catastrophique. On retient donc une amélioration par lots, contrôlée et réversible.</w:t>
+      </w:r>
+    </w:p>
+    <w:p>
+      <w:pPr>
+        <w:pStyle w:val="Heading2"/>
+      </w:pPr>
+      <w:r>
+        <w:t>14.2  Collecte anonymisée et retour des utilisateurs</w:t>
+      </w:r>
+    </w:p>
+    <w:p>
+      <w:pPr/>
+      <w:r>
+        <w:t>Les interactions (question, réponse, confiance, sources) sont journalisées de façon anonyme (aucune adresse IP, aucune donnée personnelle) sur un volume persistant. Sous chaque réponse, l'utilisateur peut donner un retour positif ou négatif (👍 / 👎), enregistré pour la revue ultérieure.</w:t>
+      </w:r>
+    </w:p>
+    <w:p>
+      <w:pPr>
+        <w:pStyle w:val="Heading2"/>
+      </w:pPr>
+      <w:r>
+        <w:t>14.3  La console de curation</w:t>
+      </w:r>
+    </w:p>
+    <w:p>
+      <w:pPr/>
+      <w:r>
+        <w:t>Une console interne (jamais exposée publiquement, accès par tunnel administrateur) présente les interactions triées par priorité (retours négatifs d'abord, puis faible confiance). Un expert relit, corrige si besoin, puis valide ou rejette chaque réponse. Les paires validées alimentent un corpus curé, au format d'entraînement. Un dosage chiffré ne peut jamais y être versé (même garde-fou réutilisé), et une source reconnue est exigée.</w:t>
+      </w:r>
+    </w:p>
+    <w:p>
+      <w:pPr>
+        <w:pStyle w:val="Heading2"/>
+      </w:pPr>
+      <w:r>
+        <w:t>14.4  Le réentraînement formalisé</w:t>
+      </w:r>
+    </w:p>
+    <w:p>
+      <w:pPr/>
+      <w:r>
+        <w:t>Le cycle complet est outillé : récupération du corpus curé depuis le cluster, assemblage (combinaison des sources, validation, déduplication), réentraînement LoRA sur pod GPU, fusion, export GGUF, puis redéploiement (envoi du modèle, rechargement de l'inférence, purge du cache, montée de version). Un runbook (docs/REENTRAINEMENT.md) décrit chaque étape. La validation humaine reste obligatoire : on n'entraîne jamais sur la sortie brute du modèle.</w:t>
+      </w:r>
+    </w:p>
+    <w:p>
+      <w:pPr>
+        <w:pStyle w:val="Heading2"/>
+      </w:pPr>
+      <w:r>
+        <w:t>14.5  Perspective : le RAG</w:t>
+      </w:r>
+    </w:p>
+    <w:p>
+      <w:pPr/>
+      <w:r>
+        <w:t>La dernière brique envisagée est la génération augmentée par récupération (RAG) : une base de connaissances interrogée à chaque requête permettrait au modèle d'intégrer de nouveaux faits validés immédiatement, sans réentraînement, tout en gardant la maîtrise des sources.</w:t>
+      </w:r>
+    </w:p>
     <w:sectPr>
       <w:footerReference w:type="default" r:id="rId10"/>
       <w:pgSz w:w="12240" w:h="15840"/>

</xml_diff>

<commit_message>
docs(technique): documenter les évolutions de la session (cacao-only, RAG, cache, 503, F11)
- CLAUDE_OpenCacao.md : §4.3 périmètre cacao uniquement (vivrier/anacarde redirigés) ;
  §7.3 alternance des rôles + clarification ciblée ; nouvelle §13bis « Évolutions
  techniques » (RAG reranking F9 + reconnaissance des sources FIRCA/ICCO/FAO, cache
  versionné par image, boucle F11 souveraine, refus F3 41→415, qualité/statut).
- docs/architecture.md : chaîne RAG (vivier → reranking lexical → top_k), cache
  versionné, alternance des rôles, garde-fous cacao-only, sources extraites du texte.
- OpenCacao-8B_Dossier-de-reference.docx : section 15 « Évolutions techniques (juin
  2026) » (7 sous-sections) ; images existantes préservées.
</commit_message>
<xml_diff>
--- a/docs/OpenCacao-8B_Dossier-de-reference.docx
+++ b/docs/OpenCacao-8B_Dossier-de-reference.docx
@@ -5118,6 +5118,115 @@
         <w:t>La dernière brique envisagée est la génération augmentée par récupération (RAG) : une base de connaissances interrogée à chaque requête permettrait au modèle d'intégrer de nouveaux faits validés immédiatement, sans réentraînement, tout en gardant la maîtrise des sources.</w:t>
       </w:r>
     </w:p>
+    <w:p>
+      <w:pPr>
+        <w:pStyle w:val="Heading1"/>
+      </w:pPr>
+      <w:r>
+        <w:t>15.  Évolutions techniques (juin 2026)</w:t>
+      </w:r>
+    </w:p>
+    <w:p>
+      <w:r>
+        <w:t>Cette section consigne les évolutions livrées et déployées en production (image v0.6.21) après la mise en service initiale, issues de retours terrain.</w:t>
+      </w:r>
+    </w:p>
+    <w:p>
+      <w:pPr>
+        <w:pStyle w:val="Heading2"/>
+      </w:pPr>
+      <w:r>
+        <w:t>15.1  Périmètre strictement cacao</w:t>
+      </w:r>
+    </w:p>
+    <w:p>
+      <w:r>
+        <w:t>Décision produit : l'assistant ne traite plus QUE le cacao. Le vivrier (maïs, manioc, igname, riz…) et l'anacarde, auparavant tolérés, sont désormais redirigés vers l'ANADER. Seuls l'ombrage et les cultures associées au service d'une plantation de cacao restent acceptables. Les garde-fous reconnaissent une question ancrée sur le cacao (elle reste traitée même si une autre culture est citée).</w:t>
+      </w:r>
+    </w:p>
+    <w:p>
+      <w:pPr>
+        <w:pStyle w:val="Heading2"/>
+      </w:pPr>
+      <w:r>
+        <w:t>15.2  Clarification consultative ciblée</w:t>
+      </w:r>
+    </w:p>
+    <w:p>
+      <w:r>
+        <w:t>Au premier tour, le système peut poser une question de précision avant de répondre (symptôme vague, intention de traitement, demande de contact sans ville). Il ne le fait plus pour une question informationnelle (prévenir, reconnaître, identifier, définir) ni pour la signature non équivoque du swollen shoot (rameaux gonflés + jaunissement) : ces cas reçoivent une réponse directe, sans salve de questions.</w:t>
+      </w:r>
+    </w:p>
+    <w:p>
+      <w:pPr>
+        <w:pStyle w:val="Heading2"/>
+      </w:pPr>
+      <w:r>
+        <w:t>15.3  RAG : reranking et reconnaissance des sources</w:t>
+      </w:r>
+    </w:p>
+    <w:p>
+      <w:r>
+        <w:t>La récupération RAG récupère désormais un vivier large par similarité dense, puis le réordonne par un score fusionné combinant la similarité dense et le recouvrement lexical (mots de la question présents dans le texte ET le nom de source du passage). Un fort recouvrement lexical fait remonter un document littéralement pertinent — par exemple dont la source contient « firca » — même quand l'embedding seul le classait trop bas ; cela corrige notamment les requêtes courtes. Le passage à des embeddings plus forts (multilingual-e5 / BGE-M3) reste un levier d'exploitation.</w:t>
+      </w:r>
+    </w:p>
+    <w:p>
+      <w:r>
+        <w:t>Par ailleurs, le champ « sources » de la réponse, extrait du texte généré, reconnaît désormais FIRCA et ICCO (et « FAO » sous sa forme courte) : une réponse correctement ancrée sur un document FIRCA n'est plus comptée comme non fiable.</w:t>
+      </w:r>
+    </w:p>
+    <w:p>
+      <w:pPr>
+        <w:pStyle w:val="Heading2"/>
+      </w:pPr>
+      <w:r>
+        <w:t>15.4  Cache de réponses versionné par image</w:t>
+      </w:r>
+    </w:p>
+    <w:p>
+      <w:r>
+        <w:t>La clé du cache Redis inclut maintenant la version de l'image API en plus de la version du modèle. Un déploiement qui change le post-traitement (extraction de sources, RAG) n'aboutit donc plus à resservir d'anciennes réponses devenues fausses ; le script de déploiement purge en outre le cache de réponses après chaque bascule.</w:t>
+      </w:r>
+    </w:p>
+    <w:p>
+      <w:pPr>
+        <w:pStyle w:val="Heading2"/>
+      </w:pPr>
+      <w:r>
+        <w:t>15.5  Correctif des indisponibilités (503)</w:t>
+      </w:r>
+    </w:p>
+    <w:p>
+      <w:r>
+        <w:t>Les erreurs « service momentanément indisponible » récurrentes provenaient du modèle d'inférence : le gabarit de conversation de Ministral 3 exige une stricte alternance des rôles utilisateur/assistant ; un historique mal formé déclenchait une exception qui faisait échouer l'inférence (500), remontée en 503. La construction des messages garantit désormais cette alternance (fusion des tours de même rôle, retrait d'un assistant en tête, dernier message = la question). Ce n'était ni un dépassement de délai ni un dépassement de contexte.</w:t>
+      </w:r>
+    </w:p>
+    <w:p>
+      <w:pPr>
+        <w:pStyle w:val="Heading2"/>
+      </w:pPr>
+      <w:r>
+        <w:t>15.6  Boucle d'amélioration souveraine</w:t>
+      </w:r>
+    </w:p>
+    <w:p>
+      <w:r>
+        <w:t>La curation du journal de production (retours 👍/👎) s'appuie sur un modèle-maître OUVERT auto-hébergé (Qwen-AWQ servi en local), sans aucune API tierce — conforme à la souveraineté. Le maître ne produit que la réponse corrigée ; la question d'origine (issue du journal) sert d'instruction. Le corpus curé ainsi enrichi alimente le ré-entraînement périodique.</w:t>
+      </w:r>
+    </w:p>
+    <w:p>
+      <w:pPr>
+        <w:pStyle w:val="Heading2"/>
+      </w:pPr>
+      <w:r>
+        <w:t>15.7  Corpus de refus élargi et qualité</w:t>
+      </w:r>
+    </w:p>
+    <w:p>
+      <w:r>
+        <w:t>Le corpus de refus est passé de 41 à 415 paires (dosage, médical, vétérinaire, image, hors-filière, évasion de dose, zones non cacaoyères du Nord, ambiguïté de culture), généré de façon déterministe et validée. La couverture de tests de l'API atteint 98 % (seuil d'intégration continue relevé à 97 %).</w:t>
+      </w:r>
+    </w:p>
     <w:sectPr>
       <w:footerReference w:type="default" r:id="rId10"/>
       <w:pgSz w:w="12240" w:h="15840"/>

</xml_diff>